<commit_message>
docs: update delivery document with downloadable artifacts and 30 tests
</commit_message>
<xml_diff>
--- a/docs/entrega_desafio_tecnico.docx
+++ b/docs/entrega_desafio_tecnico.docx
@@ -937,7 +937,23 @@
           <w:color w:val="000000"/>
           <w:sz w:val="24"/>
         </w:rPr>
-        <w:t>Tentativas de captura nos portais foram mantidas como evidência (Shadow DOM piercing em BH, contexto stealth em Barueri, formulário preenchido no RJ).</w:t>
+        <w:t>Materialização em arquivos baixáveis: cada empresa recebe um comprovante de cadastro em PDF (gerado dos dados da Receita) e cada nota com chave decodificável recebe um JSON estruturado com os campos extraídos e validados.</w:t>
+      </w:r>
+    </w:p>
+    <w:p>
+      <w:pPr>
+        <w:pStyle w:val="ListBullet"/>
+        <w:spacing w:after="80"/>
+        <w:jc w:val="both"/>
+      </w:pPr>
+      <w:r>
+        <w:rPr>
+          <w:rFonts w:ascii="Arial" w:hAnsi="Arial"/>
+          <w:b w:val="0"/>
+          <w:color w:val="000000"/>
+          <w:sz w:val="24"/>
+        </w:rPr>
+        <w:t>Tentativas de captura nos portais foram mantidas como evidência (Shadow DOM piercing em BH, contexto stealth em Barueri, formulário preenchido no RJ, página de consulta pública oficial no NFS-e Nacional).</w:t>
       </w:r>
     </w:p>
     <w:p>
@@ -1301,6 +1317,22 @@
           <w:color w:val="000000"/>
           <w:sz w:val="24"/>
         </w:rPr>
+        <w:t>reportlab para gerar o comprovante de cadastro em PDF a partir dos dados da Receita.</w:t>
+      </w:r>
+    </w:p>
+    <w:p>
+      <w:pPr>
+        <w:pStyle w:val="ListBullet"/>
+        <w:spacing w:after="80"/>
+        <w:jc w:val="both"/>
+      </w:pPr>
+      <w:r>
+        <w:rPr>
+          <w:rFonts w:ascii="Arial" w:hAnsi="Arial"/>
+          <w:b w:val="0"/>
+          <w:color w:val="000000"/>
+          <w:sz w:val="24"/>
+        </w:rPr>
         <w:t>Rich para tabela de progresso ao vivo no terminal durante a execução.</w:t>
       </w:r>
     </w:p>
@@ -1349,7 +1381,7 @@
           <w:color w:val="000000"/>
           <w:sz w:val="24"/>
         </w:rPr>
-        <w:t>GitHub Actions (CI) para execução automática dos 28 testes a cada push.</w:t>
+        <w:t>GitHub Actions (CI) para execução automática dos 30 testes a cada push.</w:t>
       </w:r>
     </w:p>
     <w:p>
@@ -1418,7 +1450,7 @@
           <w:color w:val="000000"/>
           <w:sz w:val="24"/>
         </w:rPr>
-        <w:t>output/resultado_&lt;timestamp&gt;.xlsx — planilha com 19 colunas de resultado (dados cadastrais, dados da chave decodificada, validações e caminhos de arquivo), coloridas por status.</w:t>
+        <w:t>output/resultado_&lt;timestamp&gt;.xlsx — planilha com 20 colunas de resultado (dados cadastrais, dados da chave decodificada, validações e caminhos de arquivo), coloridas por status.</w:t>
       </w:r>
     </w:p>
     <w:p>
@@ -1466,7 +1498,39 @@
           <w:color w:val="000000"/>
           <w:sz w:val="24"/>
         </w:rPr>
-        <w:t>output/evidencias/&lt;MUNICIPIO&gt;/&lt;CNPJ&gt;/ — screenshots de cadastro e notas fiscais por empresa.</w:t>
+        <w:t>output/evidencias/&lt;MUNICIPIO&gt;/&lt;CNPJ&gt;/comprovante_cadastro_&lt;CNPJ&gt;.pdf — comprovante de cadastro gerado.</w:t>
+      </w:r>
+    </w:p>
+    <w:p>
+      <w:pPr>
+        <w:pStyle w:val="ListBullet"/>
+        <w:spacing w:after="80"/>
+        <w:jc w:val="both"/>
+      </w:pPr>
+      <w:r>
+        <w:rPr>
+          <w:rFonts w:ascii="Arial" w:hAnsi="Arial"/>
+          <w:b w:val="0"/>
+          <w:color w:val="000000"/>
+          <w:sz w:val="24"/>
+        </w:rPr>
+        <w:t>output/evidencias/&lt;MUNICIPIO&gt;/&lt;CNPJ&gt;/notas/dados_nota_&lt;n&gt;.json — dados decodificados e validados da nota.</w:t>
+      </w:r>
+    </w:p>
+    <w:p>
+      <w:pPr>
+        <w:pStyle w:val="ListBullet"/>
+        <w:spacing w:after="80"/>
+        <w:jc w:val="both"/>
+      </w:pPr>
+      <w:r>
+        <w:rPr>
+          <w:rFonts w:ascii="Arial" w:hAnsi="Arial"/>
+          <w:b w:val="0"/>
+          <w:color w:val="000000"/>
+          <w:sz w:val="24"/>
+        </w:rPr>
+        <w:t>output/evidencias/&lt;MUNICIPIO&gt;/&lt;CNPJ&gt;/ — screenshots dos portais como evidência das tentativas.</w:t>
       </w:r>
     </w:p>
     <w:p>

</xml_diff>

<commit_message>
docs: add SEFIN Nacional mTLS path to delivery document
</commit_message>
<xml_diff>
--- a/docs/entrega_desafio_tecnico.docx
+++ b/docs/entrega_desafio_tecnico.docx
@@ -921,6 +921,22 @@
           <w:color w:val="000000"/>
           <w:sz w:val="24"/>
         </w:rPr>
+        <w:t>Busca oficial na NFS-e Federal: o canal sancionado para baixar a nota por chave é a API SEFIN Nacional, que exige certificado digital ICP-Brasil (e-CNPJ A1) via mTLS — o endpoint responde 496 (SSL certificate required) sem ele. O cliente está implementado e pronto para produção: com o certificado da empresa configurado, baixa o XML real da nota; sem ele, registra a tentativa. Os portais públicos não permitem fetch programático (consulta pública com hCaptcha, Emissor com login gov.br), o que foi verificado empiricamente.</w:t>
+      </w:r>
+    </w:p>
+    <w:p>
+      <w:pPr>
+        <w:pStyle w:val="ListBullet"/>
+        <w:spacing w:after="80"/>
+        <w:jc w:val="both"/>
+      </w:pPr>
+      <w:r>
+        <w:rPr>
+          <w:rFonts w:ascii="Arial" w:hAnsi="Arial"/>
+          <w:b w:val="0"/>
+          <w:color w:val="000000"/>
+          <w:sz w:val="24"/>
+        </w:rPr>
         <w:t>Validação cruzada de auditoria: o CNPJ do emitente embutido na chave é comparado ao fornecedor listado na planilha, sinalizando divergências fiscais.</w:t>
       </w:r>
     </w:p>
@@ -1381,7 +1397,23 @@
           <w:color w:val="000000"/>
           <w:sz w:val="24"/>
         </w:rPr>
-        <w:t>GitHub Actions (CI) para execução automática dos 30 testes a cada push.</w:t>
+        <w:t>Cliente SEFIN Nacional com httpx mTLS (certificado ICP-Brasil) para o fetch oficial da NFS-e Federal por chave.</w:t>
+      </w:r>
+    </w:p>
+    <w:p>
+      <w:pPr>
+        <w:pStyle w:val="ListBullet"/>
+        <w:spacing w:after="80"/>
+        <w:jc w:val="both"/>
+      </w:pPr>
+      <w:r>
+        <w:rPr>
+          <w:rFonts w:ascii="Arial" w:hAnsi="Arial"/>
+          <w:b w:val="0"/>
+          <w:color w:val="000000"/>
+          <w:sz w:val="24"/>
+        </w:rPr>
+        <w:t>GitHub Actions (CI) para execução automática dos 33 testes a cada push.</w:t>
       </w:r>
     </w:p>
     <w:p>

</xml_diff>